<commit_message>
Update docs: manual coverage for Settings, Pause, Death, Sound sections
- README.md: added Screens table, Sound SFX table, updated ESC controls
- generate_report.py: added Pause Screen, Death Screen, Sound sections to section 2 manual
- report.docx: regenerated from updated generate_report.py
- video_script.md: added Settings demo, Pause/Death section, SFX mention, updated timing to ~10 min

https://claude.ai/code/session_015GZ6UZRBTb9MAGFWTpExWF
</commit_message>
<xml_diff>
--- a/report.docx
+++ b/report.docx
@@ -976,7 +976,7 @@
           <w:i w:val="0"/>
           <w:sz w:val="32"/>
         </w:rPr>
-        <w:t>Settings — ตั้งค่าเสียงและการแสดงผล</w:t>
+        <w:t>Settings — ตั้งค่าเสียง BGM (เพลงพื้นหลัง) และ SFX (เสียงเอฟเฟกต์) แยกกัน</w:t>
       </w:r>
     </w:p>
     <w:p>
@@ -1545,7 +1545,7 @@
                 <w:i w:val="0"/>
                 <w:sz w:val="30"/>
               </w:rPr>
-              <w:t>หยุดชั่วคราว / แสดงกล่อง Quit</w:t>
+              <w:t>เปิดเมนูหยุดเกมชั่วคราว (Pause) / ออกจากหน้าเมนู</w:t>
             </w:r>
           </w:p>
         </w:tc>
@@ -2448,6 +2448,539 @@
         </w:rPr>
         <w:t>[ภาพ Screenshot กระเป๋าสัมภาระ]</w:t>
       </w:r>
+    </w:p>
+    <w:p>
+      <w:pPr>
+        <w:spacing w:before="120" w:after="60" w:lineRule="auto" w:line="276"/>
+        <w:jc w:val="left"/>
+      </w:pPr>
+      <w:r>
+        <w:rPr>
+          <w:rFonts w:ascii="TH Sarabun New" w:hAnsi="TH Sarabun New" w:cs="TH Sarabun New" w:eastAsia="TH Sarabun New"/>
+          <w:rFonts w:ascii="TH Sarabun New" w:hAnsi="TH Sarabun New"/>
+          <w:b/>
+          <w:i w:val="0"/>
+          <w:sz w:val="32"/>
+        </w:rPr>
+        <w:t>หน้าหยุดเกมชั่วคราว (Pause Screen)</w:t>
+      </w:r>
+    </w:p>
+    <w:p>
+      <w:pPr>
+        <w:spacing w:before="0" w:after="80" w:lineRule="auto" w:line="276"/>
+        <w:jc w:val="left"/>
+      </w:pPr>
+      <w:r>
+        <w:rPr>
+          <w:rFonts w:ascii="TH Sarabun New" w:hAnsi="TH Sarabun New" w:cs="TH Sarabun New" w:eastAsia="TH Sarabun New"/>
+          <w:rFonts w:ascii="TH Sarabun New" w:hAnsi="TH Sarabun New"/>
+          <w:b w:val="0"/>
+          <w:i w:val="0"/>
+          <w:sz w:val="32"/>
+        </w:rPr>
+        <w:t>กด ESC ระหว่างเกมเพื่อเปิด Pause Screen ซึ่งมีปุ่มดังนี้:</w:t>
+      </w:r>
+    </w:p>
+    <w:p>
+      <w:pPr>
+        <w:pStyle w:val="ListBullet"/>
+        <w:spacing w:before="0" w:after="60"/>
+      </w:pPr>
+      <w:r>
+        <w:rPr>
+          <w:rFonts w:ascii="TH Sarabun New" w:hAnsi="TH Sarabun New" w:cs="TH Sarabun New" w:eastAsia="TH Sarabun New"/>
+          <w:rFonts w:ascii="TH Sarabun New" w:hAnsi="TH Sarabun New"/>
+          <w:b w:val="0"/>
+          <w:i w:val="0"/>
+          <w:sz w:val="32"/>
+        </w:rPr>
+        <w:t>▶ Resume — กลับสู่การเล่นต่อ (หรือกด ESC อีกครั้ง)</w:t>
+      </w:r>
+    </w:p>
+    <w:p>
+      <w:pPr>
+        <w:pStyle w:val="ListBullet"/>
+        <w:spacing w:before="0" w:after="60"/>
+      </w:pPr>
+      <w:r>
+        <w:rPr>
+          <w:rFonts w:ascii="TH Sarabun New" w:hAnsi="TH Sarabun New" w:cs="TH Sarabun New" w:eastAsia="TH Sarabun New"/>
+          <w:rFonts w:ascii="TH Sarabun New" w:hAnsi="TH Sarabun New"/>
+          <w:b w:val="0"/>
+          <w:i w:val="0"/>
+          <w:sz w:val="32"/>
+        </w:rPr>
+        <w:t>⚙ Settings — เปิดหน้าตั้งค่าเสียง BGM/SFX ได้แม้อยู่ในเกม</w:t>
+      </w:r>
+    </w:p>
+    <w:p>
+      <w:pPr>
+        <w:pStyle w:val="ListBullet"/>
+        <w:spacing w:before="0" w:after="60"/>
+      </w:pPr>
+      <w:r>
+        <w:rPr>
+          <w:rFonts w:ascii="TH Sarabun New" w:hAnsi="TH Sarabun New" w:cs="TH Sarabun New" w:eastAsia="TH Sarabun New"/>
+          <w:rFonts w:ascii="TH Sarabun New" w:hAnsi="TH Sarabun New"/>
+          <w:b w:val="0"/>
+          <w:i w:val="0"/>
+          <w:sz w:val="32"/>
+        </w:rPr>
+        <w:t>⏹ Main Menu — ออกจากเกมและกลับสู่หน้าหลัก (เพลงจะหยุด)</w:t>
+      </w:r>
+    </w:p>
+    <w:p>
+      <w:pPr>
+        <w:spacing w:before="120" w:after="40"/>
+        <w:jc w:val="center"/>
+        <w:shd w:val="clear" w:color="auto" w:fill="D9D9D9"/>
+      </w:pPr>
+      <w:r>
+        <w:rPr>
+          <w:rFonts w:ascii="TH Sarabun New" w:hAnsi="TH Sarabun New" w:cs="TH Sarabun New" w:eastAsia="TH Sarabun New"/>
+          <w:rFonts w:ascii="TH Sarabun New" w:hAnsi="TH Sarabun New"/>
+          <w:b w:val="0"/>
+          <w:i/>
+          <w:color w:val="505050"/>
+          <w:sz w:val="28"/>
+        </w:rPr>
+        <w:br/>
+        <w:br/>
+        <w:br/>
+        <w:t>[ภาพ Screenshot Pause Screen]</w:t>
+        <w:br/>
+        <w:br/>
+        <w:br/>
+      </w:r>
+    </w:p>
+    <w:p>
+      <w:pPr>
+        <w:spacing w:before="0" w:after="120" w:lineRule="auto" w:line="276"/>
+        <w:jc w:val="center"/>
+      </w:pPr>
+      <w:r>
+        <w:rPr>
+          <w:rFonts w:ascii="TH Sarabun New" w:hAnsi="TH Sarabun New" w:cs="TH Sarabun New" w:eastAsia="TH Sarabun New"/>
+          <w:rFonts w:ascii="TH Sarabun New" w:hAnsi="TH Sarabun New"/>
+          <w:b w:val="0"/>
+          <w:i/>
+          <w:sz w:val="26"/>
+        </w:rPr>
+        <w:t>[ภาพ Screenshot Pause Screen]</w:t>
+      </w:r>
+    </w:p>
+    <w:p>
+      <w:pPr>
+        <w:spacing w:before="120" w:after="60" w:lineRule="auto" w:line="276"/>
+        <w:jc w:val="left"/>
+      </w:pPr>
+      <w:r>
+        <w:rPr>
+          <w:rFonts w:ascii="TH Sarabun New" w:hAnsi="TH Sarabun New" w:cs="TH Sarabun New" w:eastAsia="TH Sarabun New"/>
+          <w:rFonts w:ascii="TH Sarabun New" w:hAnsi="TH Sarabun New"/>
+          <w:b/>
+          <w:i w:val="0"/>
+          <w:sz w:val="32"/>
+        </w:rPr>
+        <w:t>หน้าตัวละครตาย (Death Screen)</w:t>
+      </w:r>
+    </w:p>
+    <w:p>
+      <w:pPr>
+        <w:spacing w:before="0" w:after="80" w:lineRule="auto" w:line="276"/>
+        <w:jc w:val="left"/>
+      </w:pPr>
+      <w:r>
+        <w:rPr>
+          <w:rFonts w:ascii="TH Sarabun New" w:hAnsi="TH Sarabun New" w:cs="TH Sarabun New" w:eastAsia="TH Sarabun New"/>
+          <w:rFonts w:ascii="TH Sarabun New" w:hAnsi="TH Sarabun New"/>
+          <w:b w:val="0"/>
+          <w:i w:val="0"/>
+          <w:sz w:val="32"/>
+        </w:rPr>
+        <w:t>เมื่อ HP ลดลงถึง 0 เกมจะแสดงหน้าผลลัพธ์บนหน้าจอ พร้อมปุ่มสองปุ่มที่ด้านล่าง:</w:t>
+      </w:r>
+    </w:p>
+    <w:p>
+      <w:pPr>
+        <w:pStyle w:val="ListBullet"/>
+        <w:spacing w:before="0" w:after="60"/>
+      </w:pPr>
+      <w:r>
+        <w:rPr>
+          <w:rFonts w:ascii="TH Sarabun New" w:hAnsi="TH Sarabun New" w:cs="TH Sarabun New" w:eastAsia="TH Sarabun New"/>
+          <w:rFonts w:ascii="TH Sarabun New" w:hAnsi="TH Sarabun New"/>
+          <w:b w:val="0"/>
+          <w:i w:val="0"/>
+          <w:sz w:val="32"/>
+        </w:rPr>
+        <w:t>↺ Restart — กลับไปหน้าเลือกตัวละครเพื่อเริ่มรอบใหม่</w:t>
+      </w:r>
+    </w:p>
+    <w:p>
+      <w:pPr>
+        <w:pStyle w:val="ListBullet"/>
+        <w:spacing w:before="0" w:after="60"/>
+      </w:pPr>
+      <w:r>
+        <w:rPr>
+          <w:rFonts w:ascii="TH Sarabun New" w:hAnsi="TH Sarabun New" w:cs="TH Sarabun New" w:eastAsia="TH Sarabun New"/>
+          <w:rFonts w:ascii="TH Sarabun New" w:hAnsi="TH Sarabun New"/>
+          <w:b w:val="0"/>
+          <w:i w:val="0"/>
+          <w:sz w:val="32"/>
+        </w:rPr>
+        <w:t>⏹ Main Menu — กลับสู่หน้าเมนูหลัก (เพลงหยุดโดยอัตโนมัติ)</w:t>
+      </w:r>
+    </w:p>
+    <w:p>
+      <w:pPr>
+        <w:spacing w:before="120" w:after="40"/>
+        <w:jc w:val="center"/>
+        <w:shd w:val="clear" w:color="auto" w:fill="D9D9D9"/>
+      </w:pPr>
+      <w:r>
+        <w:rPr>
+          <w:rFonts w:ascii="TH Sarabun New" w:hAnsi="TH Sarabun New" w:cs="TH Sarabun New" w:eastAsia="TH Sarabun New"/>
+          <w:rFonts w:ascii="TH Sarabun New" w:hAnsi="TH Sarabun New"/>
+          <w:b w:val="0"/>
+          <w:i/>
+          <w:color w:val="505050"/>
+          <w:sz w:val="28"/>
+        </w:rPr>
+        <w:br/>
+        <w:br/>
+        <w:br/>
+        <w:t>[ภาพ Screenshot Death Screen]</w:t>
+        <w:br/>
+        <w:br/>
+        <w:br/>
+      </w:r>
+    </w:p>
+    <w:p>
+      <w:pPr>
+        <w:spacing w:before="0" w:after="120" w:lineRule="auto" w:line="276"/>
+        <w:jc w:val="center"/>
+      </w:pPr>
+      <w:r>
+        <w:rPr>
+          <w:rFonts w:ascii="TH Sarabun New" w:hAnsi="TH Sarabun New" w:cs="TH Sarabun New" w:eastAsia="TH Sarabun New"/>
+          <w:rFonts w:ascii="TH Sarabun New" w:hAnsi="TH Sarabun New"/>
+          <w:b w:val="0"/>
+          <w:i/>
+          <w:sz w:val="26"/>
+        </w:rPr>
+        <w:t>[ภาพ Screenshot Death Screen]</w:t>
+      </w:r>
+    </w:p>
+    <w:p>
+      <w:pPr>
+        <w:spacing w:before="120" w:after="60" w:lineRule="auto" w:line="276"/>
+        <w:jc w:val="left"/>
+      </w:pPr>
+      <w:r>
+        <w:rPr>
+          <w:rFonts w:ascii="TH Sarabun New" w:hAnsi="TH Sarabun New" w:cs="TH Sarabun New" w:eastAsia="TH Sarabun New"/>
+          <w:rFonts w:ascii="TH Sarabun New" w:hAnsi="TH Sarabun New"/>
+          <w:b/>
+          <w:i w:val="0"/>
+          <w:sz w:val="32"/>
+        </w:rPr>
+        <w:t>ระบบเสียง (Sound)</w:t>
+      </w:r>
+    </w:p>
+    <w:p>
+      <w:pPr>
+        <w:spacing w:before="0" w:after="80" w:lineRule="auto" w:line="276"/>
+        <w:jc w:val="left"/>
+      </w:pPr>
+      <w:r>
+        <w:rPr>
+          <w:rFonts w:ascii="TH Sarabun New" w:hAnsi="TH Sarabun New" w:cs="TH Sarabun New" w:eastAsia="TH Sarabun New"/>
+          <w:rFonts w:ascii="TH Sarabun New" w:hAnsi="TH Sarabun New"/>
+          <w:b w:val="0"/>
+          <w:i w:val="0"/>
+          <w:sz w:val="32"/>
+        </w:rPr>
+        <w:t>เกมมีเสียงประกอบครบทุกการกระทำ:</w:t>
+      </w:r>
+    </w:p>
+    <w:tbl>
+      <w:tblPr>
+        <w:tblStyle w:val="TableGrid"/>
+        <w:tblW w:type="auto" w:w="0"/>
+        <w:tblLook w:firstColumn="1" w:firstRow="1" w:lastColumn="0" w:lastRow="0" w:noHBand="0" w:noVBand="1" w:val="04A0"/>
+      </w:tblPr>
+      <w:tblGrid>
+        <w:gridCol w:w="4549"/>
+        <w:gridCol w:w="4549"/>
+      </w:tblGrid>
+      <w:tr>
+        <w:tc>
+          <w:tcPr>
+            <w:tcW w:type="dxa" w:w="4549"/>
+          </w:tcPr>
+          <w:p/>
+        </w:tc>
+        <w:tc>
+          <w:tcPr>
+            <w:tcW w:type="dxa" w:w="4549"/>
+          </w:tcPr>
+          <w:p/>
+        </w:tc>
+      </w:tr>
+      <w:tr>
+        <w:tc>
+          <w:tcPr>
+            <w:tcW w:type="dxa" w:w="4549"/>
+            <w:shd w:val="clear" w:color="auto" w:fill="D6E4F0"/>
+          </w:tcPr>
+          <w:p>
+            <w:r/>
+            <w:r>
+              <w:rPr>
+                <w:rFonts w:ascii="TH Sarabun New" w:hAnsi="TH Sarabun New" w:cs="TH Sarabun New" w:eastAsia="TH Sarabun New"/>
+                <w:rFonts w:ascii="TH Sarabun New" w:hAnsi="TH Sarabun New"/>
+                <w:b/>
+                <w:i w:val="0"/>
+                <w:sz w:val="28"/>
+              </w:rPr>
+              <w:t>เหตุการณ์</w:t>
+            </w:r>
+          </w:p>
+        </w:tc>
+        <w:tc>
+          <w:tcPr>
+            <w:tcW w:type="dxa" w:w="4549"/>
+            <w:shd w:val="clear" w:color="auto" w:fill="D6E4F0"/>
+          </w:tcPr>
+          <w:p>
+            <w:r/>
+            <w:r>
+              <w:rPr>
+                <w:rFonts w:ascii="TH Sarabun New" w:hAnsi="TH Sarabun New" w:cs="TH Sarabun New" w:eastAsia="TH Sarabun New"/>
+                <w:rFonts w:ascii="TH Sarabun New" w:hAnsi="TH Sarabun New"/>
+                <w:b/>
+                <w:i w:val="0"/>
+                <w:sz w:val="28"/>
+              </w:rPr>
+              <w:t>เสียง</w:t>
+            </w:r>
+          </w:p>
+        </w:tc>
+      </w:tr>
+      <w:tr>
+        <w:tc>
+          <w:tcPr>
+            <w:tcW w:type="dxa" w:w="4549"/>
+          </w:tcPr>
+          <w:p>
+            <w:r/>
+            <w:r>
+              <w:rPr>
+                <w:rFonts w:ascii="TH Sarabun New" w:hAnsi="TH Sarabun New" w:cs="TH Sarabun New" w:eastAsia="TH Sarabun New"/>
+                <w:rFonts w:ascii="TH Sarabun New" w:hAnsi="TH Sarabun New"/>
+                <w:b w:val="0"/>
+                <w:i w:val="0"/>
+                <w:sz w:val="28"/>
+              </w:rPr>
+              <w:t>กดปุ่มทุกปุ่มใน UI</w:t>
+            </w:r>
+          </w:p>
+        </w:tc>
+        <w:tc>
+          <w:tcPr>
+            <w:tcW w:type="dxa" w:w="4549"/>
+          </w:tcPr>
+          <w:p>
+            <w:r/>
+            <w:r>
+              <w:rPr>
+                <w:rFonts w:ascii="TH Sarabun New" w:hAnsi="TH Sarabun New" w:cs="TH Sarabun New" w:eastAsia="TH Sarabun New"/>
+                <w:rFonts w:ascii="TH Sarabun New" w:hAnsi="TH Sarabun New"/>
+                <w:b w:val="0"/>
+                <w:i w:val="0"/>
+                <w:sz w:val="28"/>
+              </w:rPr>
+              <w:t>เสียง Click สั้น</w:t>
+            </w:r>
+          </w:p>
+        </w:tc>
+      </w:tr>
+      <w:tr>
+        <w:tc>
+          <w:tcPr>
+            <w:tcW w:type="dxa" w:w="4549"/>
+          </w:tcPr>
+          <w:p>
+            <w:r/>
+            <w:r>
+              <w:rPr>
+                <w:rFonts w:ascii="TH Sarabun New" w:hAnsi="TH Sarabun New" w:cs="TH Sarabun New" w:eastAsia="TH Sarabun New"/>
+                <w:rFonts w:ascii="TH Sarabun New" w:hAnsi="TH Sarabun New"/>
+                <w:b w:val="0"/>
+                <w:i w:val="0"/>
+                <w:sz w:val="28"/>
+              </w:rPr>
+              <w:t>เก็บ Exp Orb</w:t>
+            </w:r>
+          </w:p>
+        </w:tc>
+        <w:tc>
+          <w:tcPr>
+            <w:tcW w:type="dxa" w:w="4549"/>
+          </w:tcPr>
+          <w:p>
+            <w:r/>
+            <w:r>
+              <w:rPr>
+                <w:rFonts w:ascii="TH Sarabun New" w:hAnsi="TH Sarabun New" w:cs="TH Sarabun New" w:eastAsia="TH Sarabun New"/>
+                <w:rFonts w:ascii="TH Sarabun New" w:hAnsi="TH Sarabun New"/>
+                <w:b w:val="0"/>
+                <w:i w:val="0"/>
+                <w:sz w:val="28"/>
+              </w:rPr>
+              <w:t>เสียง Sweep ขึ้น</w:t>
+            </w:r>
+          </w:p>
+        </w:tc>
+      </w:tr>
+      <w:tr>
+        <w:tc>
+          <w:tcPr>
+            <w:tcW w:type="dxa" w:w="4549"/>
+          </w:tcPr>
+          <w:p>
+            <w:r/>
+            <w:r>
+              <w:rPr>
+                <w:rFonts w:ascii="TH Sarabun New" w:hAnsi="TH Sarabun New" w:cs="TH Sarabun New" w:eastAsia="TH Sarabun New"/>
+                <w:rFonts w:ascii="TH Sarabun New" w:hAnsi="TH Sarabun New"/>
+                <w:b w:val="0"/>
+                <w:i w:val="0"/>
+                <w:sz w:val="28"/>
+              </w:rPr>
+              <w:t>Level Up</w:t>
+            </w:r>
+          </w:p>
+        </w:tc>
+        <w:tc>
+          <w:tcPr>
+            <w:tcW w:type="dxa" w:w="4549"/>
+          </w:tcPr>
+          <w:p>
+            <w:r/>
+            <w:r>
+              <w:rPr>
+                <w:rFonts w:ascii="TH Sarabun New" w:hAnsi="TH Sarabun New" w:cs="TH Sarabun New" w:eastAsia="TH Sarabun New"/>
+                <w:rFonts w:ascii="TH Sarabun New" w:hAnsi="TH Sarabun New"/>
+                <w:b w:val="0"/>
+                <w:i w:val="0"/>
+                <w:sz w:val="28"/>
+              </w:rPr>
+              <w:t>เสียง Arpeggio C→E→G→C</w:t>
+            </w:r>
+          </w:p>
+        </w:tc>
+      </w:tr>
+      <w:tr>
+        <w:tc>
+          <w:tcPr>
+            <w:tcW w:type="dxa" w:w="4549"/>
+          </w:tcPr>
+          <w:p>
+            <w:r/>
+            <w:r>
+              <w:rPr>
+                <w:rFonts w:ascii="TH Sarabun New" w:hAnsi="TH Sarabun New" w:cs="TH Sarabun New" w:eastAsia="TH Sarabun New"/>
+                <w:rFonts w:ascii="TH Sarabun New" w:hAnsi="TH Sarabun New"/>
+                <w:b w:val="0"/>
+                <w:i w:val="0"/>
+                <w:sz w:val="28"/>
+              </w:rPr>
+              <w:t>Sukuna โจมตี (Cleave)</w:t>
+            </w:r>
+          </w:p>
+        </w:tc>
+        <w:tc>
+          <w:tcPr>
+            <w:tcW w:type="dxa" w:w="4549"/>
+          </w:tcPr>
+          <w:p>
+            <w:r/>
+            <w:r>
+              <w:rPr>
+                <w:rFonts w:ascii="TH Sarabun New" w:hAnsi="TH Sarabun New" w:cs="TH Sarabun New" w:eastAsia="TH Sarabun New"/>
+                <w:rFonts w:ascii="TH Sarabun New" w:hAnsi="TH Sarabun New"/>
+                <w:b w:val="0"/>
+                <w:i w:val="0"/>
+                <w:sz w:val="28"/>
+              </w:rPr>
+              <w:t>เสียง Slash + Swoosh</w:t>
+            </w:r>
+          </w:p>
+        </w:tc>
+      </w:tr>
+      <w:tr>
+        <w:tc>
+          <w:tcPr>
+            <w:tcW w:type="dxa" w:w="4549"/>
+          </w:tcPr>
+          <w:p>
+            <w:r/>
+            <w:r>
+              <w:rPr>
+                <w:rFonts w:ascii="TH Sarabun New" w:hAnsi="TH Sarabun New" w:cs="TH Sarabun New" w:eastAsia="TH Sarabun New"/>
+                <w:rFonts w:ascii="TH Sarabun New" w:hAnsi="TH Sarabun New"/>
+                <w:b w:val="0"/>
+                <w:i w:val="0"/>
+                <w:sz w:val="28"/>
+              </w:rPr>
+              <w:t>Gojo โจมตี (Infinity)</w:t>
+            </w:r>
+          </w:p>
+        </w:tc>
+        <w:tc>
+          <w:tcPr>
+            <w:tcW w:type="dxa" w:w="4549"/>
+          </w:tcPr>
+          <w:p>
+            <w:r/>
+            <w:r>
+              <w:rPr>
+                <w:rFonts w:ascii="TH Sarabun New" w:hAnsi="TH Sarabun New" w:cs="TH Sarabun New" w:eastAsia="TH Sarabun New"/>
+                <w:rFonts w:ascii="TH Sarabun New" w:hAnsi="TH Sarabun New"/>
+                <w:b w:val="0"/>
+                <w:i w:val="0"/>
+                <w:sz w:val="28"/>
+              </w:rPr>
+              <w:t>เสียง Hum + Shimmer</w:t>
+            </w:r>
+          </w:p>
+        </w:tc>
+      </w:tr>
+    </w:tbl>
+    <w:p>
+      <w:pPr>
+        <w:spacing w:before="0" w:after="80" w:lineRule="auto" w:line="276"/>
+        <w:jc w:val="left"/>
+      </w:pPr>
+      <w:r>
+        <w:rPr>
+          <w:rFonts w:ascii="TH Sarabun New" w:hAnsi="TH Sarabun New" w:cs="TH Sarabun New" w:eastAsia="TH Sarabun New"/>
+          <w:rFonts w:ascii="TH Sarabun New" w:hAnsi="TH Sarabun New"/>
+          <w:b w:val="0"/>
+          <w:i w:val="0"/>
+          <w:sz w:val="32"/>
+        </w:rPr>
+        <w:t>ปรับระดับเสียงได้แยกกัน ทั้ง BGM และ SFX ผ่านหน้า Settings</w:t>
+      </w:r>
+    </w:p>
+    <w:p>
+      <w:pPr>
+        <w:spacing w:before="0" w:after="120" w:lineRule="auto" w:line="276"/>
+        <w:jc w:val="left"/>
+      </w:pPr>
     </w:p>
     <w:p>
       <w:r>

</xml_diff>